<commit_message>
PSF PAK2: generowanie opisow (Czesc V i VIII); B: Obszary wymagajace rozwoju z kompetencji
</commit_message>
<xml_diff>
--- a/public/wzory/PSF_PAK2_Karta_doradztwa_bilans_szablon.docx
+++ b/public/wzory/PSF_PAK2_Karta_doradztwa_bilans_szablon.docx
@@ -1429,7 +1429,7 @@
           <w:sz w:val="20"/>
           <w:szCs w:val="20"/>
         </w:rPr>
-        <w:t xml:space="preserve">________________________________________________________________________________</w:t>
+        <w:t xml:space="preserve">{{opis_potrzeb}}</w:t>
       </w:r>
     </w:p>
     <w:p>
@@ -1926,7 +1926,7 @@
           <w:sz w:val="20"/>
           <w:szCs w:val="20"/>
         </w:rPr>
-        <w:t xml:space="preserve">________________________________________________________________________________</w:t>
+        <w:t xml:space="preserve">{{opis_przebiegu}}</w:t>
       </w:r>
     </w:p>
     <w:p>
@@ -1980,7 +1980,7 @@
           <w:sz w:val="20"/>
           <w:szCs w:val="20"/>
         </w:rPr>
-        <w:t xml:space="preserve">________________________________________________________________________________</w:t>
+        <w:t xml:space="preserve">{{rekomendacje_wnioski}}</w:t>
       </w:r>
     </w:p>
     <w:p>

</xml_diff>